<commit_message>
Add AT10 spool output file
</commit_message>
<xml_diff>
--- a/Assignments/Ass1/ca_assumptions.docx
+++ b/Assignments/Ass1/ca_assumptions.docx
@@ -19,13 +19,7 @@
         <w:rPr>
           <w:rStyle w:val="Strong"/>
         </w:rPr>
-        <w:t xml:space="preserve">Student ID: </w:t>
-      </w:r>
-      <w:r>
-        <w:rPr>
-          <w:rStyle w:val="Strong"/>
-        </w:rPr>
-        <w:t>34267433</w:t>
+        <w:t>Student ID: 34267433</w:t>
       </w:r>
       <w:r>
         <w:t xml:space="preserve"> </w:t>
@@ -361,6 +355,18 @@
       </w:pPr>
       <w:r>
         <w:t>An OWNER may own zero properties at the time of being added to the system (assumed).</w:t>
+      </w:r>
+    </w:p>
+    <w:p>
+      <w:pPr>
+        <w:pStyle w:val="whitespace-normal"/>
+        <w:numPr>
+          <w:ilvl w:val="0"/>
+          <w:numId w:val="2"/>
+        </w:numPr>
+      </w:pPr>
+      <w:r>
+        <w:t>A TRUCK may exist in the system before it has made any collections (assumed). Therefore, the minimum cardinality on the TRUCK side of the TRUCK-COLLECTION relationship is zero.</w:t>
       </w:r>
     </w:p>
     <w:p/>

</xml_diff>